<commit_message>
Attachment constraints, previews, storage fixes
The patch tightens request attachments to PDF/DOC/DOCX/ZIP, enforces a 75MB per-request cap, hides ZIP preview buttons, and keeps inline preview for DOCX/PDF while preserving download actions. It also standardizes storage quotas to 512MB for user storage, updates admin/user upload validation and templates, and fixes floating action buttons, in-app confirmation modals, and related regression tests.
</commit_message>
<xml_diff>
--- a/HRCP-KKU-Academic/uploads/academic/9/doc_1.docx
+++ b/HRCP-KKU-Academic/uploads/academic/9/doc_1.docx
@@ -1492,7 +1492,7 @@
                 <w:szCs w:val="32"/>
                 <w:lang w:bidi="th-TH"/>
               </w:rPr>
-              <w:t>{{title}}</w:t>
+              <w:t>ผู้ช่วยศาสตราจารย์</w:t>
             </w:r>
             <w:r>
               <w:rPr>
@@ -1501,7 +1501,7 @@
                 <w:szCs w:val="32"/>
                 <w:lang w:bidi="th-TH"/>
               </w:rPr>
-              <w:t>อาจารย์ปาณ จันทร์</w:t>
+              <w:t>สมชาย ใจดีวิชาการ</w:t>
             </w:r>
             <w:proofErr w:type="spellStart"/>
             <w:r>
@@ -1559,7 +1559,7 @@
                 <w:cs/>
                 <w:lang w:bidi="th-TH"/>
               </w:rPr>
-              <w:t>(นางสาวจิราภรณ์  หอมอ่อน)</w:t>
+              <w:t>()</w:t>
             </w:r>
           </w:p>
         </w:tc>

</xml_diff>